<commit_message>
cập nhật chi tiết notebook
</commit_message>
<xml_diff>
--- a/HLI_ViT5_final.docx
+++ b/HLI_ViT5_final.docx
@@ -250,8 +250,16 @@
           <w:szCs w:val="28"/>
           <w:lang w:val="vi-VN"/>
         </w:rPr>
-        <w:tab/>
-        <w:t xml:space="preserve">+ Cải tiến lớn nhất: </w:t>
+        <w:t>(</w:t>
+      </w:r>
+      <w:r>
+        <w:rPr>
+          <w:rFonts w:ascii="Times New Roman" w:hAnsi="Times New Roman" w:cs="Times New Roman"/>
+          <w:sz w:val="28"/>
+          <w:szCs w:val="28"/>
+          <w:lang w:val="vi-VN"/>
+        </w:rPr>
+        <w:t xml:space="preserve">Cải tiến lớn nhất: </w:t>
       </w:r>
       <w:r>
         <w:rPr>
@@ -269,7 +277,16 @@
           <w:szCs w:val="28"/>
           <w:lang w:val="vi-VN"/>
         </w:rPr>
-        <w:t>Model không chỉ nhìn đầu văn bản, mà nó nhìn toàn bộ</w:t>
+        <w:t xml:space="preserve">Model không chỉ nhìn đầu văn bản, mà nó nhìn toàn </w:t>
+      </w:r>
+      <w:r>
+        <w:rPr>
+          <w:rFonts w:ascii="Times New Roman" w:hAnsi="Times New Roman" w:cs="Times New Roman"/>
+          <w:sz w:val="28"/>
+          <w:szCs w:val="28"/>
+          <w:lang w:val="vi-VN"/>
+        </w:rPr>
+        <w:t>bộ)</w:t>
       </w:r>
     </w:p>
     <w:p>
@@ -794,16 +811,8 @@
           <w:lang w:val="vi-VN"/>
         </w:rPr>
       </w:pPr>
-    </w:p>
-    <w:p>
-      <w:pPr>
-        <w:rPr>
-          <w:rFonts w:ascii="Times New Roman" w:hAnsi="Times New Roman" w:cs="Times New Roman"/>
-          <w:sz w:val="28"/>
-          <w:szCs w:val="28"/>
-          <w:lang w:val="vi-VN"/>
-        </w:rPr>
-      </w:pPr>
+      <w:bookmarkStart w:id="0" w:name="_GoBack"/>
+      <w:bookmarkEnd w:id="0"/>
     </w:p>
     <w:p>
       <w:pPr>
@@ -1028,6 +1037,24 @@
           <w:rStyle w:val="VerbatimChar"/>
         </w:rPr>
         <w:t>Tạo chunk ≤ 256 token</w:t>
+      </w:r>
+      <w:r>
+        <w:br/>
+      </w:r>
+      <w:r>
+        <w:rPr>
+          <w:rStyle w:val="VerbatimChar"/>
+        </w:rPr>
+        <w:t xml:space="preserve">        ↓</w:t>
+      </w:r>
+      <w:r>
+        <w:br/>
+      </w:r>
+      <w:r>
+        <w:rPr>
+          <w:rStyle w:val="VerbatimChar"/>
+        </w:rPr>
+        <w:t>Overlap 1 câu giữa các chunk</w:t>
       </w:r>
       <w:r>
         <w:br/>
@@ -1046,24 +1073,6 @@
         <w:rPr>
           <w:rStyle w:val="VerbatimChar"/>
         </w:rPr>
-        <w:t>Overlap 1 câu giữa các chunk</w:t>
-      </w:r>
-      <w:r>
-        <w:br/>
-      </w:r>
-      <w:r>
-        <w:rPr>
-          <w:rStyle w:val="VerbatimChar"/>
-        </w:rPr>
-        <w:t xml:space="preserve">        ↓</w:t>
-      </w:r>
-      <w:r>
-        <w:br/>
-      </w:r>
-      <w:r>
-        <w:rPr>
-          <w:rStyle w:val="VerbatimChar"/>
-        </w:rPr>
         <w:t>Tính điểm từng chunk</w:t>
       </w:r>
       <w:r>
@@ -2034,53 +2043,53 @@
           <w:szCs w:val="28"/>
           <w:lang w:val="vi-VN"/>
         </w:rPr>
+        <w:t xml:space="preserve">* Nhóm </w:t>
+      </w:r>
+      <w:r>
+        <w:rPr>
+          <w:rFonts w:ascii="Times New Roman" w:hAnsi="Times New Roman" w:cs="Times New Roman"/>
+          <w:sz w:val="28"/>
+          <w:szCs w:val="28"/>
+          <w:lang w:val="vi-VN"/>
+        </w:rPr>
+        <w:t>4</w:t>
+      </w:r>
+      <w:r>
+        <w:rPr>
+          <w:rFonts w:ascii="Times New Roman" w:hAnsi="Times New Roman" w:cs="Times New Roman"/>
+          <w:sz w:val="28"/>
+          <w:szCs w:val="28"/>
+          <w:lang w:val="vi-VN"/>
+        </w:rPr>
+        <w:t xml:space="preserve">: </w:t>
+      </w:r>
+      <w:r>
+        <w:rPr>
+          <w:rFonts w:ascii="Times New Roman" w:hAnsi="Times New Roman" w:cs="Times New Roman"/>
+          <w:sz w:val="28"/>
+          <w:szCs w:val="28"/>
+          <w:lang w:val="vi-VN"/>
+        </w:rPr>
+        <w:t>Perfomance (Hiệu năng)</w:t>
+      </w:r>
+    </w:p>
+    <w:p>
+      <w:pPr>
+        <w:rPr>
+          <w:rFonts w:ascii="Times New Roman" w:hAnsi="Times New Roman" w:cs="Times New Roman"/>
+          <w:sz w:val="28"/>
+          <w:szCs w:val="28"/>
+          <w:lang w:val="vi-VN"/>
+        </w:rPr>
+      </w:pPr>
+      <w:r>
+        <w:rPr>
+          <w:rFonts w:ascii="Times New Roman" w:hAnsi="Times New Roman" w:cs="Times New Roman"/>
+          <w:sz w:val="28"/>
+          <w:szCs w:val="28"/>
+          <w:lang w:val="vi-VN"/>
+        </w:rPr>
         <w:lastRenderedPageBreak/>
-        <w:t xml:space="preserve">* Nhóm </w:t>
-      </w:r>
-      <w:r>
-        <w:rPr>
-          <w:rFonts w:ascii="Times New Roman" w:hAnsi="Times New Roman" w:cs="Times New Roman"/>
-          <w:sz w:val="28"/>
-          <w:szCs w:val="28"/>
-          <w:lang w:val="vi-VN"/>
-        </w:rPr>
-        <w:t>4</w:t>
-      </w:r>
-      <w:r>
-        <w:rPr>
-          <w:rFonts w:ascii="Times New Roman" w:hAnsi="Times New Roman" w:cs="Times New Roman"/>
-          <w:sz w:val="28"/>
-          <w:szCs w:val="28"/>
-          <w:lang w:val="vi-VN"/>
-        </w:rPr>
-        <w:t xml:space="preserve">: </w:t>
-      </w:r>
-      <w:r>
-        <w:rPr>
-          <w:rFonts w:ascii="Times New Roman" w:hAnsi="Times New Roman" w:cs="Times New Roman"/>
-          <w:sz w:val="28"/>
-          <w:szCs w:val="28"/>
-          <w:lang w:val="vi-VN"/>
-        </w:rPr>
-        <w:t>Perfomance (Hiệu năng)</w:t>
-      </w:r>
-    </w:p>
-    <w:p>
-      <w:pPr>
-        <w:rPr>
-          <w:rFonts w:ascii="Times New Roman" w:hAnsi="Times New Roman" w:cs="Times New Roman"/>
-          <w:sz w:val="28"/>
-          <w:szCs w:val="28"/>
-          <w:lang w:val="vi-VN"/>
-        </w:rPr>
-      </w:pPr>
-      <w:r>
-        <w:rPr>
-          <w:rFonts w:ascii="Times New Roman" w:hAnsi="Times New Roman" w:cs="Times New Roman"/>
-          <w:sz w:val="28"/>
-          <w:szCs w:val="28"/>
-          <w:lang w:val="vi-VN"/>
-        </w:rPr>
         <w:tab/>
       </w:r>
       <w:r>
@@ -3526,6 +3535,7 @@
           <w:szCs w:val="28"/>
           <w:lang w:val="vi-VN"/>
         </w:rPr>
+        <w:lastRenderedPageBreak/>
         <w:t>8. Format đầu ra</w:t>
       </w:r>
     </w:p>
@@ -3924,8 +3934,6 @@
         </w:rPr>
         <w:t>---Hết---</w:t>
       </w:r>
-      <w:bookmarkStart w:id="0" w:name="_GoBack"/>
-      <w:bookmarkEnd w:id="0"/>
     </w:p>
     <w:sectPr>
       <w:pgSz w:w="11906" w:h="16838" w:code="9"/>
@@ -4669,7 +4677,7 @@
 </file>
 
 <file path=customXml/itemProps1.xml><?xml version="1.0" encoding="utf-8"?>
-<ds:datastoreItem xmlns:ds="http://schemas.openxmlformats.org/officeDocument/2006/customXml" ds:itemID="{84F3DE61-CD59-4682-962A-E294FF926C77}">
+<ds:datastoreItem xmlns:ds="http://schemas.openxmlformats.org/officeDocument/2006/customXml" ds:itemID="{43ABEA90-05E4-4AD1-ACB7-D03A975B3DC2}">
   <ds:schemaRefs>
     <ds:schemaRef ds:uri="http://schemas.openxmlformats.org/officeDocument/2006/bibliography"/>
   </ds:schemaRefs>

</xml_diff>